<commit_message>
feat: client 측 구현 완료
</commit_message>
<xml_diff>
--- a/모바일웹서비스 프로젝트_공통평가 01_수행 결과 보고서 - 문주영.docx
+++ b/모바일웹서비스 프로젝트_공통평가 01_수행 결과 보고서 - 문주영.docx
@@ -2290,7 +2290,7 @@
                 <w:szCs w:val="12"/>
               </w:rPr>
               <w:pict w14:anchorId="45667DA4">
-                <v:shape id="_x0000_i1034" type="#_x0000_t75" style="width:106.55pt;height:57.85pt;visibility:visible;mso-wrap-style:square">
+                <v:shape id="_x0000_i1030" type="#_x0000_t75" style="width:106.55pt;height:57.85pt;visibility:visible;mso-wrap-style:square">
                   <v:imagedata r:id="rId13" o:title=""/>
                 </v:shape>
               </w:pict>
@@ -2505,6 +2505,14 @@
                 <w:szCs w:val="12"/>
               </w:rPr>
             </w:pPr>
+            <w:r>
+              <w:rPr>
+                <w:rFonts w:hint="eastAsia"/>
+                <w:sz w:val="12"/>
+                <w:szCs w:val="12"/>
+              </w:rPr>
+              <w:t>O</w:t>
+            </w:r>
           </w:p>
         </w:tc>
         <w:tc>
@@ -2537,6 +2545,21 @@
                 <w:szCs w:val="12"/>
               </w:rPr>
             </w:pPr>
+            <w:r>
+              <w:rPr>
+                <w:rFonts w:cs="Times New Roman"/>
+                <w:noProof/>
+                <w:color w:val="auto"/>
+                <w:kern w:val="2"/>
+                <w:sz w:val="12"/>
+                <w:szCs w:val="12"/>
+              </w:rPr>
+              <w:pict w14:anchorId="52A68DCB">
+                <v:shape id="_x0000_i1036" type="#_x0000_t75" style="width:106.15pt;height:63.25pt;visibility:visible;mso-wrap-style:square">
+                  <v:imagedata r:id="rId14" o:title=""/>
+                </v:shape>
+              </w:pict>
+            </w:r>
           </w:p>
         </w:tc>
       </w:tr>
@@ -2725,6 +2748,14 @@
                 <w:szCs w:val="12"/>
               </w:rPr>
             </w:pPr>
+            <w:r>
+              <w:rPr>
+                <w:rFonts w:hint="eastAsia"/>
+                <w:sz w:val="12"/>
+                <w:szCs w:val="12"/>
+              </w:rPr>
+              <w:t>O</w:t>
+            </w:r>
           </w:p>
         </w:tc>
         <w:tc>
@@ -2757,6 +2788,21 @@
                 <w:szCs w:val="12"/>
               </w:rPr>
             </w:pPr>
+            <w:r>
+              <w:rPr>
+                <w:rFonts w:cs="Times New Roman"/>
+                <w:noProof/>
+                <w:color w:val="auto"/>
+                <w:kern w:val="2"/>
+                <w:sz w:val="12"/>
+                <w:szCs w:val="12"/>
+              </w:rPr>
+              <w:pict w14:anchorId="6BCF5862">
+                <v:shape id="_x0000_i1043" type="#_x0000_t75" style="width:106.15pt;height:63.25pt;visibility:visible;mso-wrap-style:square">
+                  <v:imagedata r:id="rId15" o:title=""/>
+                </v:shape>
+              </w:pict>
+            </w:r>
           </w:p>
         </w:tc>
       </w:tr>
@@ -4586,9 +4632,9 @@
       </w:pPr>
     </w:p>
     <w:sectPr>
-      <w:headerReference w:type="default" r:id="rId14"/>
-      <w:footerReference w:type="even" r:id="rId15"/>
-      <w:footerReference w:type="default" r:id="rId16"/>
+      <w:headerReference w:type="default" r:id="rId16"/>
+      <w:footerReference w:type="even" r:id="rId17"/>
+      <w:footerReference w:type="default" r:id="rId18"/>
       <w:footnotePr>
         <w:numRestart w:val="eachSect"/>
       </w:footnotePr>

</xml_diff>

<commit_message>
feat: client 제목/내용 view 추가
</commit_message>
<xml_diff>
--- a/모바일웹서비스 프로젝트_공통평가 01_수행 결과 보고서 - 문주영.docx
+++ b/모바일웹서비스 프로젝트_공통평가 01_수행 결과 보고서 - 문주영.docx
@@ -966,7 +966,7 @@
                 <w:szCs w:val="12"/>
               </w:rPr>
               <w:pict w14:anchorId="53752932">
-                <v:shape id="_x0000_i1044" type="#_x0000_t75" style="width:129.45pt;height:77pt;visibility:visible;mso-wrap-style:square">
+                <v:shape id="_x0000_i1074" type="#_x0000_t75" style="width:129.45pt;height:77pt;visibility:visible;mso-wrap-style:square">
                   <v:imagedata r:id="rId8" o:title=""/>
                 </v:shape>
               </w:pict>
@@ -1550,7 +1550,7 @@
                 <w:szCs w:val="12"/>
               </w:rPr>
               <w:pict w14:anchorId="44D23ED3">
-                <v:shape id="_x0000_i1026" type="#_x0000_t75" style="width:104.9pt;height:62.85pt">
+                <v:shape id="_x0000_i1075" type="#_x0000_t75" style="width:104.9pt;height:62.85pt">
                   <v:imagedata r:id="rId9" o:title="스크린샷 2026-10-19 034528"/>
                 </v:shape>
               </w:pict>
@@ -1564,7 +1564,7 @@
                 <w:szCs w:val="12"/>
               </w:rPr>
               <w:pict w14:anchorId="575253DB">
-                <v:shape id="_x0000_i1027" type="#_x0000_t75" style="width:104.9pt;height:62.85pt">
+                <v:shape id="_x0000_i1076" type="#_x0000_t75" style="width:104.9pt;height:62.85pt">
                   <v:imagedata r:id="rId10" o:title="스크린샷 2026-10-19 034630"/>
                 </v:shape>
               </w:pict>
@@ -1794,7 +1794,7 @@
                 <w:szCs w:val="12"/>
               </w:rPr>
               <w:pict w14:anchorId="13450B6A">
-                <v:shape id="그림 1" o:spid="_x0000_i1028" type="#_x0000_t75" style="width:105.7pt;height:56.6pt;visibility:visible;mso-wrap-style:square">
+                <v:shape id="그림 1" o:spid="_x0000_i1077" type="#_x0000_t75" style="width:105.7pt;height:56.6pt;visibility:visible;mso-wrap-style:square">
                   <v:imagedata r:id="rId11" o:title=""/>
                 </v:shape>
               </w:pict>
@@ -2041,7 +2041,7 @@
                 <w:szCs w:val="12"/>
               </w:rPr>
               <w:pict w14:anchorId="6F6FABA8">
-                <v:shape id="_x0000_i1029" type="#_x0000_t75" style="width:106.15pt;height:63.25pt;visibility:visible;mso-wrap-style:square">
+                <v:shape id="_x0000_i1078" type="#_x0000_t75" style="width:106.15pt;height:63.25pt;visibility:visible;mso-wrap-style:square">
                   <v:imagedata r:id="rId13" o:title=""/>
                 </v:shape>
               </w:pict>
@@ -2331,7 +2331,7 @@
                 <w:szCs w:val="12"/>
               </w:rPr>
               <w:pict w14:anchorId="45667DA4">
-                <v:shape id="_x0000_i1030" type="#_x0000_t75" style="width:106.55pt;height:57.85pt;visibility:visible;mso-wrap-style:square">
+                <v:shape id="_x0000_i1079" type="#_x0000_t75" style="width:106.55pt;height:57.85pt;visibility:visible;mso-wrap-style:square">
                   <v:imagedata r:id="rId14" o:title=""/>
                 </v:shape>
               </w:pict>
@@ -2596,7 +2596,7 @@
                 <w:szCs w:val="12"/>
               </w:rPr>
               <w:pict w14:anchorId="52A68DCB">
-                <v:shape id="_x0000_i1031" type="#_x0000_t75" style="width:106.15pt;height:63.25pt;visibility:visible;mso-wrap-style:square">
+                <v:shape id="_x0000_i1080" type="#_x0000_t75" style="width:106.15pt;height:63.25pt;visibility:visible;mso-wrap-style:square">
                   <v:imagedata r:id="rId15" o:title=""/>
                 </v:shape>
               </w:pict>
@@ -2839,7 +2839,7 @@
                 <w:szCs w:val="12"/>
               </w:rPr>
               <w:pict w14:anchorId="6BCF5862">
-                <v:shape id="_x0000_i1032" type="#_x0000_t75" style="width:106.15pt;height:63.25pt;visibility:visible;mso-wrap-style:square">
+                <v:shape id="_x0000_i1081" type="#_x0000_t75" style="width:106.15pt;height:63.25pt;visibility:visible;mso-wrap-style:square">
                   <v:imagedata r:id="rId16" o:title=""/>
                 </v:shape>
               </w:pict>
@@ -3054,7 +3054,7 @@
                 <w:noProof/>
               </w:rPr>
               <w:pict w14:anchorId="6D2E12AC">
-                <v:shape id="_x0000_i1033" type="#_x0000_t75" style="width:106.55pt;height:127.35pt;visibility:visible;mso-wrap-style:square">
+                <v:shape id="_x0000_i1082" type="#_x0000_t75" style="width:106.55pt;height:127.35pt;visibility:visible;mso-wrap-style:square">
                   <v:imagedata r:id="rId17" o:title=""/>
                 </v:shape>
               </w:pict>
@@ -3297,7 +3297,7 @@
                 <w:szCs w:val="12"/>
               </w:rPr>
               <w:pict w14:anchorId="055D5885">
-                <v:shape id="_x0000_i1034" type="#_x0000_t75" style="width:106.95pt;height:127.75pt;visibility:visible;mso-wrap-style:square">
+                <v:shape id="_x0000_i1083" type="#_x0000_t75" style="width:106.95pt;height:127.75pt;visibility:visible;mso-wrap-style:square">
                   <v:imagedata r:id="rId18" o:title=""/>
                 </v:shape>
               </w:pict>
@@ -5321,7 +5321,7 @@
                 <w:szCs w:val="12"/>
               </w:rPr>
               <w:pict w14:anchorId="33F16A5A">
-                <v:shape id="_x0000_i1055" type="#_x0000_t75" style="width:129.45pt;height:77pt;visibility:visible;mso-wrap-style:square">
+                <v:shape id="_x0000_i1084" type="#_x0000_t75" style="width:129.45pt;height:77pt;visibility:visible;mso-wrap-style:square">
                   <v:imagedata r:id="rId19" o:title=""/>
                 </v:shape>
               </w:pict>
@@ -5541,7 +5541,7 @@
                 <w:szCs w:val="12"/>
               </w:rPr>
               <w:pict w14:anchorId="7B5A1B0D">
-                <v:shape id="_x0000_i1067" type="#_x0000_t75" style="width:129pt;height:154.4pt;visibility:visible;mso-wrap-style:square">
+                <v:shape id="_x0000_i1085" type="#_x0000_t75" style="width:129pt;height:154.4pt;visibility:visible;mso-wrap-style:square">
                   <v:imagedata r:id="rId20" o:title=""/>
                 </v:shape>
               </w:pict>
@@ -5663,6 +5663,14 @@
                 <w:szCs w:val="12"/>
               </w:rPr>
             </w:pPr>
+            <w:r>
+              <w:rPr>
+                <w:rFonts w:hint="eastAsia"/>
+                <w:sz w:val="12"/>
+                <w:szCs w:val="12"/>
+              </w:rPr>
+              <w:t>O</w:t>
+            </w:r>
           </w:p>
         </w:tc>
         <w:tc>
@@ -5695,6 +5703,47 @@
                 <w:szCs w:val="12"/>
               </w:rPr>
             </w:pPr>
+            <w:r>
+              <w:rPr>
+                <w:rFonts w:cs="Times New Roman"/>
+                <w:color w:val="auto"/>
+                <w:kern w:val="2"/>
+                <w:sz w:val="12"/>
+                <w:szCs w:val="12"/>
+              </w:rPr>
+              <w:t>C</w:t>
+            </w:r>
+            <w:r>
+              <w:rPr>
+                <w:rFonts w:cs="Times New Roman" w:hint="eastAsia"/>
+                <w:color w:val="auto"/>
+                <w:kern w:val="2"/>
+                <w:sz w:val="12"/>
+                <w:szCs w:val="12"/>
+              </w:rPr>
+              <w:t>lient 측 제목/설명 view 추가</w:t>
+            </w:r>
+          </w:p>
+          <w:p>
+            <w:pPr>
+              <w:rPr>
+                <w:rFonts w:cs="Times New Roman" w:hint="eastAsia"/>
+                <w:color w:val="auto"/>
+                <w:kern w:val="2"/>
+                <w:sz w:val="12"/>
+                <w:szCs w:val="12"/>
+              </w:rPr>
+            </w:pPr>
+            <w:r>
+              <w:rPr>
+                <w:noProof/>
+              </w:rPr>
+              <w:pict w14:anchorId="5BF97B89">
+                <v:shape id="_x0000_i1098" type="#_x0000_t75" style="width:129.45pt;height:154.8pt;visibility:visible;mso-wrap-style:square">
+                  <v:imagedata r:id="rId21" o:title=""/>
+                </v:shape>
+              </w:pict>
+            </w:r>
           </w:p>
         </w:tc>
       </w:tr>
@@ -6149,9 +6198,9 @@
       </w:pPr>
     </w:p>
     <w:sectPr>
-      <w:headerReference w:type="default" r:id="rId21"/>
-      <w:footerReference w:type="even" r:id="rId22"/>
-      <w:footerReference w:type="default" r:id="rId23"/>
+      <w:headerReference w:type="default" r:id="rId22"/>
+      <w:footerReference w:type="even" r:id="rId23"/>
+      <w:footerReference w:type="default" r:id="rId24"/>
       <w:footnotePr>
         <w:numRestart w:val="eachSect"/>
       </w:footnotePr>

</xml_diff>

<commit_message>
feat: client UI 개선
</commit_message>
<xml_diff>
--- a/모바일웹서비스 프로젝트_공통평가 01_수행 결과 보고서 - 문주영.docx
+++ b/모바일웹서비스 프로젝트_공통평가 01_수행 결과 보고서 - 문주영.docx
@@ -966,7 +966,7 @@
                 <w:szCs w:val="12"/>
               </w:rPr>
               <w:pict w14:anchorId="53752932">
-                <v:shape id="_x0000_i1074" type="#_x0000_t75" style="width:129.45pt;height:77pt;visibility:visible;mso-wrap-style:square">
+                <v:shape id="_x0000_i1080" type="#_x0000_t75" style="width:129.45pt;height:77pt;visibility:visible;mso-wrap-style:square">
                   <v:imagedata r:id="rId8" o:title=""/>
                 </v:shape>
               </w:pict>
@@ -1550,7 +1550,7 @@
                 <w:szCs w:val="12"/>
               </w:rPr>
               <w:pict w14:anchorId="44D23ED3">
-                <v:shape id="_x0000_i1075" type="#_x0000_t75" style="width:104.9pt;height:62.85pt">
+                <v:shape id="_x0000_i1081" type="#_x0000_t75" style="width:104.9pt;height:62.85pt">
                   <v:imagedata r:id="rId9" o:title="스크린샷 2026-10-19 034528"/>
                 </v:shape>
               </w:pict>
@@ -1564,7 +1564,7 @@
                 <w:szCs w:val="12"/>
               </w:rPr>
               <w:pict w14:anchorId="575253DB">
-                <v:shape id="_x0000_i1076" type="#_x0000_t75" style="width:104.9pt;height:62.85pt">
+                <v:shape id="_x0000_i1082" type="#_x0000_t75" style="width:104.9pt;height:62.85pt">
                   <v:imagedata r:id="rId10" o:title="스크린샷 2026-10-19 034630"/>
                 </v:shape>
               </w:pict>
@@ -1794,7 +1794,7 @@
                 <w:szCs w:val="12"/>
               </w:rPr>
               <w:pict w14:anchorId="13450B6A">
-                <v:shape id="그림 1" o:spid="_x0000_i1077" type="#_x0000_t75" style="width:105.7pt;height:56.6pt;visibility:visible;mso-wrap-style:square">
+                <v:shape id="그림 1" o:spid="_x0000_i1083" type="#_x0000_t75" style="width:105.7pt;height:56.6pt;visibility:visible;mso-wrap-style:square">
                   <v:imagedata r:id="rId11" o:title=""/>
                 </v:shape>
               </w:pict>
@@ -2041,7 +2041,7 @@
                 <w:szCs w:val="12"/>
               </w:rPr>
               <w:pict w14:anchorId="6F6FABA8">
-                <v:shape id="_x0000_i1078" type="#_x0000_t75" style="width:106.15pt;height:63.25pt;visibility:visible;mso-wrap-style:square">
+                <v:shape id="_x0000_i1084" type="#_x0000_t75" style="width:106.15pt;height:63.25pt;visibility:visible;mso-wrap-style:square">
                   <v:imagedata r:id="rId13" o:title=""/>
                 </v:shape>
               </w:pict>
@@ -2331,7 +2331,7 @@
                 <w:szCs w:val="12"/>
               </w:rPr>
               <w:pict w14:anchorId="45667DA4">
-                <v:shape id="_x0000_i1079" type="#_x0000_t75" style="width:106.55pt;height:57.85pt;visibility:visible;mso-wrap-style:square">
+                <v:shape id="_x0000_i1085" type="#_x0000_t75" style="width:106.55pt;height:57.85pt;visibility:visible;mso-wrap-style:square">
                   <v:imagedata r:id="rId14" o:title=""/>
                 </v:shape>
               </w:pict>
@@ -2596,7 +2596,7 @@
                 <w:szCs w:val="12"/>
               </w:rPr>
               <w:pict w14:anchorId="52A68DCB">
-                <v:shape id="_x0000_i1080" type="#_x0000_t75" style="width:106.15pt;height:63.25pt;visibility:visible;mso-wrap-style:square">
+                <v:shape id="_x0000_i1086" type="#_x0000_t75" style="width:106.15pt;height:63.25pt;visibility:visible;mso-wrap-style:square">
                   <v:imagedata r:id="rId15" o:title=""/>
                 </v:shape>
               </w:pict>
@@ -2839,7 +2839,7 @@
                 <w:szCs w:val="12"/>
               </w:rPr>
               <w:pict w14:anchorId="6BCF5862">
-                <v:shape id="_x0000_i1081" type="#_x0000_t75" style="width:106.15pt;height:63.25pt;visibility:visible;mso-wrap-style:square">
+                <v:shape id="_x0000_i1087" type="#_x0000_t75" style="width:106.15pt;height:63.25pt;visibility:visible;mso-wrap-style:square">
                   <v:imagedata r:id="rId16" o:title=""/>
                 </v:shape>
               </w:pict>
@@ -3054,7 +3054,7 @@
                 <w:noProof/>
               </w:rPr>
               <w:pict w14:anchorId="6D2E12AC">
-                <v:shape id="_x0000_i1082" type="#_x0000_t75" style="width:106.55pt;height:127.35pt;visibility:visible;mso-wrap-style:square">
+                <v:shape id="_x0000_i1088" type="#_x0000_t75" style="width:106.55pt;height:127.35pt;visibility:visible;mso-wrap-style:square">
                   <v:imagedata r:id="rId17" o:title=""/>
                 </v:shape>
               </w:pict>
@@ -3297,7 +3297,7 @@
                 <w:szCs w:val="12"/>
               </w:rPr>
               <w:pict w14:anchorId="055D5885">
-                <v:shape id="_x0000_i1083" type="#_x0000_t75" style="width:106.95pt;height:127.75pt;visibility:visible;mso-wrap-style:square">
+                <v:shape id="_x0000_i1089" type="#_x0000_t75" style="width:106.95pt;height:127.75pt;visibility:visible;mso-wrap-style:square">
                   <v:imagedata r:id="rId18" o:title=""/>
                 </v:shape>
               </w:pict>
@@ -5321,7 +5321,7 @@
                 <w:szCs w:val="12"/>
               </w:rPr>
               <w:pict w14:anchorId="33F16A5A">
-                <v:shape id="_x0000_i1084" type="#_x0000_t75" style="width:129.45pt;height:77pt;visibility:visible;mso-wrap-style:square">
+                <v:shape id="_x0000_i1090" type="#_x0000_t75" style="width:129.45pt;height:77pt;visibility:visible;mso-wrap-style:square">
                   <v:imagedata r:id="rId19" o:title=""/>
                 </v:shape>
               </w:pict>
@@ -5541,7 +5541,7 @@
                 <w:szCs w:val="12"/>
               </w:rPr>
               <w:pict w14:anchorId="7B5A1B0D">
-                <v:shape id="_x0000_i1085" type="#_x0000_t75" style="width:129pt;height:154.4pt;visibility:visible;mso-wrap-style:square">
+                <v:shape id="_x0000_i1091" type="#_x0000_t75" style="width:129pt;height:154.4pt;visibility:visible;mso-wrap-style:square">
                   <v:imagedata r:id="rId20" o:title=""/>
                 </v:shape>
               </w:pict>
@@ -5727,7 +5727,7 @@
           <w:p>
             <w:pPr>
               <w:rPr>
-                <w:rFonts w:cs="Times New Roman" w:hint="eastAsia"/>
+                <w:rFonts w:cs="Times New Roman"/>
                 <w:color w:val="auto"/>
                 <w:kern w:val="2"/>
                 <w:sz w:val="12"/>
@@ -5739,8 +5739,246 @@
                 <w:noProof/>
               </w:rPr>
               <w:pict w14:anchorId="5BF97B89">
-                <v:shape id="_x0000_i1098" type="#_x0000_t75" style="width:129.45pt;height:154.8pt;visibility:visible;mso-wrap-style:square">
+                <v:shape id="_x0000_i1092" type="#_x0000_t75" style="width:129.45pt;height:154.8pt;visibility:visible;mso-wrap-style:square">
                   <v:imagedata r:id="rId21" o:title=""/>
+                </v:shape>
+              </w:pict>
+            </w:r>
+          </w:p>
+        </w:tc>
+      </w:tr>
+      <w:tr>
+        <w:trPr>
+          <w:trHeight w:val="655"/>
+        </w:trPr>
+        <w:tc>
+          <w:tcPr>
+            <w:tcW w:w="595" w:type="dxa"/>
+            <w:vAlign w:val="center"/>
+          </w:tcPr>
+          <w:p>
+            <w:pPr>
+              <w:jc w:val="center"/>
+              <w:rPr>
+                <w:sz w:val="12"/>
+                <w:szCs w:val="12"/>
+              </w:rPr>
+            </w:pPr>
+          </w:p>
+        </w:tc>
+        <w:tc>
+          <w:tcPr>
+            <w:tcW w:w="603" w:type="dxa"/>
+            <w:vAlign w:val="center"/>
+          </w:tcPr>
+          <w:p>
+            <w:pPr>
+              <w:jc w:val="center"/>
+              <w:rPr>
+                <w:sz w:val="12"/>
+                <w:szCs w:val="12"/>
+              </w:rPr>
+            </w:pPr>
+          </w:p>
+        </w:tc>
+        <w:tc>
+          <w:tcPr>
+            <w:tcW w:w="1382" w:type="dxa"/>
+          </w:tcPr>
+          <w:p>
+            <w:pPr>
+              <w:jc w:val="left"/>
+              <w:rPr>
+                <w:sz w:val="12"/>
+                <w:szCs w:val="12"/>
+              </w:rPr>
+            </w:pPr>
+          </w:p>
+        </w:tc>
+        <w:tc>
+          <w:tcPr>
+            <w:tcW w:w="3582" w:type="dxa"/>
+          </w:tcPr>
+          <w:p>
+            <w:pPr>
+              <w:rPr>
+                <w:sz w:val="12"/>
+                <w:szCs w:val="12"/>
+              </w:rPr>
+            </w:pPr>
+          </w:p>
+        </w:tc>
+        <w:tc>
+          <w:tcPr>
+            <w:tcW w:w="484" w:type="dxa"/>
+            <w:vAlign w:val="center"/>
+          </w:tcPr>
+          <w:p>
+            <w:pPr>
+              <w:jc w:val="center"/>
+              <w:rPr>
+                <w:sz w:val="12"/>
+                <w:szCs w:val="12"/>
+              </w:rPr>
+            </w:pPr>
+            <w:r>
+              <w:rPr>
+                <w:rFonts w:hint="eastAsia"/>
+                <w:sz w:val="12"/>
+                <w:szCs w:val="12"/>
+              </w:rPr>
+              <w:t>O</w:t>
+            </w:r>
+          </w:p>
+        </w:tc>
+        <w:tc>
+          <w:tcPr>
+            <w:tcW w:w="426" w:type="dxa"/>
+            <w:vAlign w:val="center"/>
+          </w:tcPr>
+          <w:p>
+            <w:pPr>
+              <w:jc w:val="center"/>
+              <w:rPr>
+                <w:sz w:val="12"/>
+                <w:szCs w:val="12"/>
+              </w:rPr>
+            </w:pPr>
+          </w:p>
+        </w:tc>
+        <w:tc>
+          <w:tcPr>
+            <w:tcW w:w="2173" w:type="dxa"/>
+            <w:vAlign w:val="center"/>
+          </w:tcPr>
+          <w:p>
+            <w:pPr>
+              <w:rPr>
+                <w:rFonts w:cs="Times New Roman"/>
+                <w:color w:val="auto"/>
+                <w:kern w:val="2"/>
+                <w:sz w:val="12"/>
+                <w:szCs w:val="12"/>
+              </w:rPr>
+            </w:pPr>
+            <w:r>
+              <w:rPr>
+                <w:rFonts w:cs="Times New Roman"/>
+                <w:color w:val="auto"/>
+                <w:kern w:val="2"/>
+                <w:sz w:val="12"/>
+                <w:szCs w:val="12"/>
+              </w:rPr>
+              <w:t>C</w:t>
+            </w:r>
+            <w:r>
+              <w:rPr>
+                <w:rFonts w:cs="Times New Roman" w:hint="eastAsia"/>
+                <w:color w:val="auto"/>
+                <w:kern w:val="2"/>
+                <w:sz w:val="12"/>
+                <w:szCs w:val="12"/>
+              </w:rPr>
+              <w:t>lient 측 UI 개선</w:t>
+            </w:r>
+          </w:p>
+          <w:p>
+            <w:pPr>
+              <w:numPr>
+                <w:ilvl w:val="0"/>
+                <w:numId w:val="103"/>
+              </w:numPr>
+              <w:rPr>
+                <w:rFonts w:cs="Times New Roman"/>
+                <w:color w:val="auto"/>
+                <w:kern w:val="2"/>
+                <w:sz w:val="12"/>
+                <w:szCs w:val="12"/>
+              </w:rPr>
+            </w:pPr>
+            <w:r>
+              <w:rPr>
+                <w:rFonts w:cs="Times New Roman" w:hint="eastAsia"/>
+                <w:color w:val="auto"/>
+                <w:kern w:val="2"/>
+                <w:sz w:val="12"/>
+                <w:szCs w:val="12"/>
+              </w:rPr>
+              <w:t>image 비율 유지</w:t>
+            </w:r>
+          </w:p>
+          <w:p>
+            <w:pPr>
+              <w:numPr>
+                <w:ilvl w:val="0"/>
+                <w:numId w:val="103"/>
+              </w:numPr>
+              <w:rPr>
+                <w:rFonts w:cs="Times New Roman"/>
+                <w:color w:val="auto"/>
+                <w:kern w:val="2"/>
+                <w:sz w:val="12"/>
+                <w:szCs w:val="12"/>
+              </w:rPr>
+            </w:pPr>
+            <w:r>
+              <w:rPr>
+                <w:rFonts w:cs="Times New Roman" w:hint="eastAsia"/>
+                <w:color w:val="auto"/>
+                <w:kern w:val="2"/>
+                <w:sz w:val="12"/>
+                <w:szCs w:val="12"/>
+              </w:rPr>
+              <w:t>색상 변경</w:t>
+            </w:r>
+          </w:p>
+          <w:p>
+            <w:pPr>
+              <w:numPr>
+                <w:ilvl w:val="0"/>
+                <w:numId w:val="103"/>
+              </w:numPr>
+              <w:rPr>
+                <w:rFonts w:cs="Times New Roman"/>
+                <w:color w:val="auto"/>
+                <w:kern w:val="2"/>
+                <w:sz w:val="12"/>
+                <w:szCs w:val="12"/>
+              </w:rPr>
+            </w:pPr>
+            <w:r>
+              <w:rPr>
+                <w:rFonts w:cs="Times New Roman" w:hint="eastAsia"/>
+                <w:color w:val="auto"/>
+                <w:kern w:val="2"/>
+                <w:sz w:val="12"/>
+                <w:szCs w:val="12"/>
+              </w:rPr>
+              <w:t>버튼 간격 추가</w:t>
+            </w:r>
+          </w:p>
+          <w:p>
+            <w:pPr>
+              <w:rPr>
+                <w:rFonts w:cs="Times New Roman" w:hint="eastAsia"/>
+                <w:color w:val="auto"/>
+                <w:kern w:val="2"/>
+                <w:sz w:val="12"/>
+                <w:szCs w:val="12"/>
+              </w:rPr>
+            </w:pPr>
+            <w:r>
+              <w:rPr>
+                <w:rFonts w:cs="Times New Roman"/>
+                <w:noProof/>
+                <w:color w:val="auto"/>
+                <w:kern w:val="2"/>
+                <w:sz w:val="12"/>
+                <w:szCs w:val="12"/>
+              </w:rPr>
+              <w:pict w14:anchorId="295AF3B1">
+                <v:shape id="_x0000_i1106" type="#_x0000_t75" style="width:129pt;height:154.4pt;visibility:visible;mso-wrap-style:square">
+                  <v:imagedata r:id="rId22" o:title=""/>
                 </v:shape>
               </w:pict>
             </w:r>
@@ -6074,115 +6312,6 @@
           </w:p>
         </w:tc>
       </w:tr>
-      <w:tr>
-        <w:trPr>
-          <w:trHeight w:val="655"/>
-        </w:trPr>
-        <w:tc>
-          <w:tcPr>
-            <w:tcW w:w="595" w:type="dxa"/>
-            <w:vAlign w:val="center"/>
-          </w:tcPr>
-          <w:p>
-            <w:pPr>
-              <w:jc w:val="center"/>
-              <w:rPr>
-                <w:sz w:val="12"/>
-                <w:szCs w:val="12"/>
-              </w:rPr>
-            </w:pPr>
-          </w:p>
-        </w:tc>
-        <w:tc>
-          <w:tcPr>
-            <w:tcW w:w="603" w:type="dxa"/>
-            <w:vAlign w:val="center"/>
-          </w:tcPr>
-          <w:p>
-            <w:pPr>
-              <w:jc w:val="center"/>
-              <w:rPr>
-                <w:sz w:val="12"/>
-                <w:szCs w:val="12"/>
-              </w:rPr>
-            </w:pPr>
-          </w:p>
-        </w:tc>
-        <w:tc>
-          <w:tcPr>
-            <w:tcW w:w="1382" w:type="dxa"/>
-          </w:tcPr>
-          <w:p>
-            <w:pPr>
-              <w:jc w:val="left"/>
-              <w:rPr>
-                <w:sz w:val="12"/>
-                <w:szCs w:val="12"/>
-              </w:rPr>
-            </w:pPr>
-          </w:p>
-        </w:tc>
-        <w:tc>
-          <w:tcPr>
-            <w:tcW w:w="3582" w:type="dxa"/>
-          </w:tcPr>
-          <w:p>
-            <w:pPr>
-              <w:rPr>
-                <w:sz w:val="12"/>
-                <w:szCs w:val="12"/>
-              </w:rPr>
-            </w:pPr>
-          </w:p>
-        </w:tc>
-        <w:tc>
-          <w:tcPr>
-            <w:tcW w:w="484" w:type="dxa"/>
-            <w:vAlign w:val="center"/>
-          </w:tcPr>
-          <w:p>
-            <w:pPr>
-              <w:jc w:val="center"/>
-              <w:rPr>
-                <w:sz w:val="12"/>
-                <w:szCs w:val="12"/>
-              </w:rPr>
-            </w:pPr>
-          </w:p>
-        </w:tc>
-        <w:tc>
-          <w:tcPr>
-            <w:tcW w:w="426" w:type="dxa"/>
-            <w:vAlign w:val="center"/>
-          </w:tcPr>
-          <w:p>
-            <w:pPr>
-              <w:jc w:val="center"/>
-              <w:rPr>
-                <w:sz w:val="12"/>
-                <w:szCs w:val="12"/>
-              </w:rPr>
-            </w:pPr>
-          </w:p>
-        </w:tc>
-        <w:tc>
-          <w:tcPr>
-            <w:tcW w:w="2173" w:type="dxa"/>
-            <w:vAlign w:val="center"/>
-          </w:tcPr>
-          <w:p>
-            <w:pPr>
-              <w:rPr>
-                <w:rFonts w:cs="Times New Roman"/>
-                <w:color w:val="auto"/>
-                <w:kern w:val="2"/>
-                <w:sz w:val="12"/>
-                <w:szCs w:val="12"/>
-              </w:rPr>
-            </w:pPr>
-          </w:p>
-        </w:tc>
-      </w:tr>
     </w:tbl>
     <w:p>
       <w:pPr>
@@ -6198,9 +6327,9 @@
       </w:pPr>
     </w:p>
     <w:sectPr>
-      <w:headerReference w:type="default" r:id="rId22"/>
-      <w:footerReference w:type="even" r:id="rId23"/>
-      <w:footerReference w:type="default" r:id="rId24"/>
+      <w:headerReference w:type="default" r:id="rId23"/>
+      <w:footerReference w:type="even" r:id="rId24"/>
+      <w:footerReference w:type="default" r:id="rId25"/>
       <w:footnotePr>
         <w:numRestart w:val="eachSect"/>
       </w:footnotePr>
@@ -8421,6 +8550,118 @@
     </w:lvl>
   </w:abstractNum>
   <w:abstractNum w:abstractNumId="19" w15:restartNumberingAfterBreak="0">
+    <w:nsid w:val="1BF41DBE"/>
+    <w:multiLevelType w:val="hybridMultilevel"/>
+    <w:tmpl w:val="FEB02DAA"/>
+    <w:lvl w:ilvl="0" w:tplc="C7129C8A">
+      <w:numFmt w:val="bullet"/>
+      <w:lvlText w:val="-"/>
+      <w:lvlJc w:val="left"/>
+      <w:pPr>
+        <w:ind w:left="800" w:hanging="360"/>
+      </w:pPr>
+      <w:rPr>
+        <w:rFonts w:ascii="바탕체" w:eastAsia="바탕체" w:hAnsi="바탕체" w:cs="Times New Roman" w:hint="eastAsia"/>
+      </w:rPr>
+    </w:lvl>
+    <w:lvl w:ilvl="1" w:tplc="04090003" w:tentative="1">
+      <w:start w:val="1"/>
+      <w:numFmt w:val="bullet"/>
+      <w:lvlText w:val=""/>
+      <w:lvlJc w:val="left"/>
+      <w:pPr>
+        <w:ind w:left="1320" w:hanging="440"/>
+      </w:pPr>
+      <w:rPr>
+        <w:rFonts w:ascii="Wingdings" w:hAnsi="Wingdings" w:hint="default"/>
+      </w:rPr>
+    </w:lvl>
+    <w:lvl w:ilvl="2" w:tplc="04090005" w:tentative="1">
+      <w:start w:val="1"/>
+      <w:numFmt w:val="bullet"/>
+      <w:lvlText w:val=""/>
+      <w:lvlJc w:val="left"/>
+      <w:pPr>
+        <w:ind w:left="1760" w:hanging="440"/>
+      </w:pPr>
+      <w:rPr>
+        <w:rFonts w:ascii="Wingdings" w:hAnsi="Wingdings" w:hint="default"/>
+      </w:rPr>
+    </w:lvl>
+    <w:lvl w:ilvl="3" w:tplc="04090001" w:tentative="1">
+      <w:start w:val="1"/>
+      <w:numFmt w:val="bullet"/>
+      <w:lvlText w:val=""/>
+      <w:lvlJc w:val="left"/>
+      <w:pPr>
+        <w:ind w:left="2200" w:hanging="440"/>
+      </w:pPr>
+      <w:rPr>
+        <w:rFonts w:ascii="Wingdings" w:hAnsi="Wingdings" w:hint="default"/>
+      </w:rPr>
+    </w:lvl>
+    <w:lvl w:ilvl="4" w:tplc="04090003" w:tentative="1">
+      <w:start w:val="1"/>
+      <w:numFmt w:val="bullet"/>
+      <w:lvlText w:val=""/>
+      <w:lvlJc w:val="left"/>
+      <w:pPr>
+        <w:ind w:left="2640" w:hanging="440"/>
+      </w:pPr>
+      <w:rPr>
+        <w:rFonts w:ascii="Wingdings" w:hAnsi="Wingdings" w:hint="default"/>
+      </w:rPr>
+    </w:lvl>
+    <w:lvl w:ilvl="5" w:tplc="04090005" w:tentative="1">
+      <w:start w:val="1"/>
+      <w:numFmt w:val="bullet"/>
+      <w:lvlText w:val=""/>
+      <w:lvlJc w:val="left"/>
+      <w:pPr>
+        <w:ind w:left="3080" w:hanging="440"/>
+      </w:pPr>
+      <w:rPr>
+        <w:rFonts w:ascii="Wingdings" w:hAnsi="Wingdings" w:hint="default"/>
+      </w:rPr>
+    </w:lvl>
+    <w:lvl w:ilvl="6" w:tplc="04090001" w:tentative="1">
+      <w:start w:val="1"/>
+      <w:numFmt w:val="bullet"/>
+      <w:lvlText w:val=""/>
+      <w:lvlJc w:val="left"/>
+      <w:pPr>
+        <w:ind w:left="3520" w:hanging="440"/>
+      </w:pPr>
+      <w:rPr>
+        <w:rFonts w:ascii="Wingdings" w:hAnsi="Wingdings" w:hint="default"/>
+      </w:rPr>
+    </w:lvl>
+    <w:lvl w:ilvl="7" w:tplc="04090003" w:tentative="1">
+      <w:start w:val="1"/>
+      <w:numFmt w:val="bullet"/>
+      <w:lvlText w:val=""/>
+      <w:lvlJc w:val="left"/>
+      <w:pPr>
+        <w:ind w:left="3960" w:hanging="440"/>
+      </w:pPr>
+      <w:rPr>
+        <w:rFonts w:ascii="Wingdings" w:hAnsi="Wingdings" w:hint="default"/>
+      </w:rPr>
+    </w:lvl>
+    <w:lvl w:ilvl="8" w:tplc="04090005" w:tentative="1">
+      <w:start w:val="1"/>
+      <w:numFmt w:val="bullet"/>
+      <w:lvlText w:val=""/>
+      <w:lvlJc w:val="left"/>
+      <w:pPr>
+        <w:ind w:left="4400" w:hanging="440"/>
+      </w:pPr>
+      <w:rPr>
+        <w:rFonts w:ascii="Wingdings" w:hAnsi="Wingdings" w:hint="default"/>
+      </w:rPr>
+    </w:lvl>
+  </w:abstractNum>
+  <w:abstractNum w:abstractNumId="20" w15:restartNumberingAfterBreak="0">
     <w:nsid w:val="1C34291C"/>
     <w:multiLevelType w:val="multilevel"/>
     <w:tmpl w:val="04D4BA54"/>
@@ -8562,7 +8803,7 @@
       </w:rPr>
     </w:lvl>
   </w:abstractNum>
-  <w:abstractNum w:abstractNumId="20" w15:restartNumberingAfterBreak="0">
+  <w:abstractNum w:abstractNumId="21" w15:restartNumberingAfterBreak="0">
     <w:nsid w:val="1D9C2E02"/>
     <w:multiLevelType w:val="hybridMultilevel"/>
     <w:tmpl w:val="67CC5908"/>
@@ -8679,7 +8920,7 @@
       </w:pPr>
     </w:lvl>
   </w:abstractNum>
-  <w:abstractNum w:abstractNumId="21" w15:restartNumberingAfterBreak="0">
+  <w:abstractNum w:abstractNumId="22" w15:restartNumberingAfterBreak="0">
     <w:nsid w:val="1FA0779A"/>
     <w:multiLevelType w:val="multilevel"/>
     <w:tmpl w:val="F86E35A6"/>
@@ -8822,7 +9063,7 @@
       </w:rPr>
     </w:lvl>
   </w:abstractNum>
-  <w:abstractNum w:abstractNumId="22" w15:restartNumberingAfterBreak="0">
+  <w:abstractNum w:abstractNumId="23" w15:restartNumberingAfterBreak="0">
     <w:nsid w:val="22861CCE"/>
     <w:multiLevelType w:val="multilevel"/>
     <w:tmpl w:val="9552E68C"/>
@@ -8965,7 +9206,7 @@
       </w:rPr>
     </w:lvl>
   </w:abstractNum>
-  <w:abstractNum w:abstractNumId="23" w15:restartNumberingAfterBreak="0">
+  <w:abstractNum w:abstractNumId="24" w15:restartNumberingAfterBreak="0">
     <w:nsid w:val="230E064C"/>
     <w:multiLevelType w:val="singleLevel"/>
     <w:tmpl w:val="0324B5DC"/>
@@ -8988,7 +9229,7 @@
       </w:rPr>
     </w:lvl>
   </w:abstractNum>
-  <w:abstractNum w:abstractNumId="24" w15:restartNumberingAfterBreak="0">
+  <w:abstractNum w:abstractNumId="25" w15:restartNumberingAfterBreak="0">
     <w:nsid w:val="23552AC5"/>
     <w:multiLevelType w:val="hybridMultilevel"/>
     <w:tmpl w:val="566CE078"/>
@@ -9129,7 +9370,7 @@
       </w:rPr>
     </w:lvl>
   </w:abstractNum>
-  <w:abstractNum w:abstractNumId="25" w15:restartNumberingAfterBreak="0">
+  <w:abstractNum w:abstractNumId="26" w15:restartNumberingAfterBreak="0">
     <w:nsid w:val="247B392B"/>
     <w:multiLevelType w:val="hybridMultilevel"/>
     <w:tmpl w:val="FD0EADE8"/>
@@ -9246,7 +9487,7 @@
       </w:pPr>
     </w:lvl>
   </w:abstractNum>
-  <w:abstractNum w:abstractNumId="26" w15:restartNumberingAfterBreak="0">
+  <w:abstractNum w:abstractNumId="27" w15:restartNumberingAfterBreak="0">
     <w:nsid w:val="258D59D2"/>
     <w:multiLevelType w:val="hybridMultilevel"/>
     <w:tmpl w:val="F3662590"/>
@@ -9370,7 +9611,7 @@
       </w:pPr>
     </w:lvl>
   </w:abstractNum>
-  <w:abstractNum w:abstractNumId="27" w15:restartNumberingAfterBreak="0">
+  <w:abstractNum w:abstractNumId="28" w15:restartNumberingAfterBreak="0">
     <w:nsid w:val="2A4317FE"/>
     <w:multiLevelType w:val="hybridMultilevel"/>
     <w:tmpl w:val="CB52AC22"/>
@@ -9511,7 +9752,7 @@
       </w:rPr>
     </w:lvl>
   </w:abstractNum>
-  <w:abstractNum w:abstractNumId="28" w15:restartNumberingAfterBreak="0">
+  <w:abstractNum w:abstractNumId="29" w15:restartNumberingAfterBreak="0">
     <w:nsid w:val="2A4F56A5"/>
     <w:multiLevelType w:val="hybridMultilevel"/>
     <w:tmpl w:val="83C6CA7C"/>
@@ -9607,7 +9848,7 @@
       </w:pPr>
     </w:lvl>
   </w:abstractNum>
-  <w:abstractNum w:abstractNumId="29" w15:restartNumberingAfterBreak="0">
+  <w:abstractNum w:abstractNumId="30" w15:restartNumberingAfterBreak="0">
     <w:nsid w:val="2A81462F"/>
     <w:multiLevelType w:val="hybridMultilevel"/>
     <w:tmpl w:val="EB92F46E"/>
@@ -9748,7 +9989,7 @@
       </w:rPr>
     </w:lvl>
   </w:abstractNum>
-  <w:abstractNum w:abstractNumId="30" w15:restartNumberingAfterBreak="0">
+  <w:abstractNum w:abstractNumId="31" w15:restartNumberingAfterBreak="0">
     <w:nsid w:val="2A9F5298"/>
     <w:multiLevelType w:val="hybridMultilevel"/>
     <w:tmpl w:val="CA966A08"/>
@@ -9862,7 +10103,7 @@
       </w:rPr>
     </w:lvl>
   </w:abstractNum>
-  <w:abstractNum w:abstractNumId="31" w15:restartNumberingAfterBreak="0">
+  <w:abstractNum w:abstractNumId="32" w15:restartNumberingAfterBreak="0">
     <w:nsid w:val="2AAA6B0E"/>
     <w:multiLevelType w:val="multilevel"/>
     <w:tmpl w:val="E90AAD70"/>
@@ -10003,7 +10244,7 @@
       </w:rPr>
     </w:lvl>
   </w:abstractNum>
-  <w:abstractNum w:abstractNumId="32" w15:restartNumberingAfterBreak="0">
+  <w:abstractNum w:abstractNumId="33" w15:restartNumberingAfterBreak="0">
     <w:nsid w:val="2D8166DD"/>
     <w:multiLevelType w:val="hybridMultilevel"/>
     <w:tmpl w:val="976ED638"/>
@@ -10116,7 +10357,7 @@
       </w:rPr>
     </w:lvl>
   </w:abstractNum>
-  <w:abstractNum w:abstractNumId="33" w15:restartNumberingAfterBreak="0">
+  <w:abstractNum w:abstractNumId="34" w15:restartNumberingAfterBreak="0">
     <w:nsid w:val="2DE27916"/>
     <w:multiLevelType w:val="hybridMultilevel"/>
     <w:tmpl w:val="CBFC1460"/>
@@ -10258,7 +10499,7 @@
       </w:rPr>
     </w:lvl>
   </w:abstractNum>
-  <w:abstractNum w:abstractNumId="34" w15:restartNumberingAfterBreak="0">
+  <w:abstractNum w:abstractNumId="35" w15:restartNumberingAfterBreak="0">
     <w:nsid w:val="2E40027E"/>
     <w:multiLevelType w:val="hybridMultilevel"/>
     <w:tmpl w:val="9D6CC7AE"/>
@@ -10377,7 +10618,7 @@
       </w:pPr>
     </w:lvl>
   </w:abstractNum>
-  <w:abstractNum w:abstractNumId="35" w15:restartNumberingAfterBreak="0">
+  <w:abstractNum w:abstractNumId="36" w15:restartNumberingAfterBreak="0">
     <w:nsid w:val="2F285ABF"/>
     <w:multiLevelType w:val="multilevel"/>
     <w:tmpl w:val="9552E68C"/>
@@ -10520,7 +10761,7 @@
       </w:rPr>
     </w:lvl>
   </w:abstractNum>
-  <w:abstractNum w:abstractNumId="36" w15:restartNumberingAfterBreak="0">
+  <w:abstractNum w:abstractNumId="37" w15:restartNumberingAfterBreak="0">
     <w:nsid w:val="2FFE5D20"/>
     <w:multiLevelType w:val="multilevel"/>
     <w:tmpl w:val="0D4A1268"/>
@@ -10663,7 +10904,7 @@
       </w:rPr>
     </w:lvl>
   </w:abstractNum>
-  <w:abstractNum w:abstractNumId="37" w15:restartNumberingAfterBreak="0">
+  <w:abstractNum w:abstractNumId="38" w15:restartNumberingAfterBreak="0">
     <w:nsid w:val="330F02C8"/>
     <w:multiLevelType w:val="hybridMultilevel"/>
     <w:tmpl w:val="040A372A"/>
@@ -10752,7 +10993,7 @@
       </w:pPr>
     </w:lvl>
   </w:abstractNum>
-  <w:abstractNum w:abstractNumId="38" w15:restartNumberingAfterBreak="0">
+  <w:abstractNum w:abstractNumId="39" w15:restartNumberingAfterBreak="0">
     <w:nsid w:val="33C250F7"/>
     <w:multiLevelType w:val="multilevel"/>
     <w:tmpl w:val="330E1666"/>
@@ -10898,7 +11139,7 @@
       </w:rPr>
     </w:lvl>
   </w:abstractNum>
-  <w:abstractNum w:abstractNumId="39" w15:restartNumberingAfterBreak="0">
+  <w:abstractNum w:abstractNumId="40" w15:restartNumberingAfterBreak="0">
     <w:nsid w:val="348A4356"/>
     <w:multiLevelType w:val="multilevel"/>
     <w:tmpl w:val="EA345534"/>
@@ -11038,13 +11279,13 @@
       </w:rPr>
     </w:lvl>
   </w:abstractNum>
-  <w:abstractNum w:abstractNumId="40" w15:restartNumberingAfterBreak="0">
+  <w:abstractNum w:abstractNumId="41" w15:restartNumberingAfterBreak="0">
     <w:nsid w:val="34DF0ED7"/>
     <w:multiLevelType w:val="multilevel"/>
     <w:tmpl w:val="0409001F"/>
     <w:numStyleLink w:val="OB"/>
   </w:abstractNum>
-  <w:abstractNum w:abstractNumId="41" w15:restartNumberingAfterBreak="0">
+  <w:abstractNum w:abstractNumId="42" w15:restartNumberingAfterBreak="0">
     <w:nsid w:val="35914812"/>
     <w:multiLevelType w:val="hybridMultilevel"/>
     <w:tmpl w:val="143EEFEE"/>
@@ -11133,7 +11374,7 @@
       </w:pPr>
     </w:lvl>
   </w:abstractNum>
-  <w:abstractNum w:abstractNumId="42" w15:restartNumberingAfterBreak="0">
+  <w:abstractNum w:abstractNumId="43" w15:restartNumberingAfterBreak="0">
     <w:nsid w:val="35E957E9"/>
     <w:multiLevelType w:val="singleLevel"/>
     <w:tmpl w:val="8DD0F758"/>
@@ -11154,7 +11395,7 @@
       </w:rPr>
     </w:lvl>
   </w:abstractNum>
-  <w:abstractNum w:abstractNumId="43" w15:restartNumberingAfterBreak="0">
+  <w:abstractNum w:abstractNumId="44" w15:restartNumberingAfterBreak="0">
     <w:nsid w:val="362F62F8"/>
     <w:multiLevelType w:val="hybridMultilevel"/>
     <w:tmpl w:val="00F4C866"/>
@@ -11243,7 +11484,7 @@
       </w:pPr>
     </w:lvl>
   </w:abstractNum>
-  <w:abstractNum w:abstractNumId="44" w15:restartNumberingAfterBreak="0">
+  <w:abstractNum w:abstractNumId="45" w15:restartNumberingAfterBreak="0">
     <w:nsid w:val="377B3094"/>
     <w:multiLevelType w:val="hybridMultilevel"/>
     <w:tmpl w:val="4DBC9BC6"/>
@@ -11332,7 +11573,7 @@
       </w:pPr>
     </w:lvl>
   </w:abstractNum>
-  <w:abstractNum w:abstractNumId="45" w15:restartNumberingAfterBreak="0">
+  <w:abstractNum w:abstractNumId="46" w15:restartNumberingAfterBreak="0">
     <w:nsid w:val="37A91194"/>
     <w:multiLevelType w:val="hybridMultilevel"/>
     <w:tmpl w:val="D018AFB8"/>
@@ -11473,7 +11714,7 @@
       </w:rPr>
     </w:lvl>
   </w:abstractNum>
-  <w:abstractNum w:abstractNumId="46" w15:restartNumberingAfterBreak="0">
+  <w:abstractNum w:abstractNumId="47" w15:restartNumberingAfterBreak="0">
     <w:nsid w:val="3BBE3752"/>
     <w:multiLevelType w:val="hybridMultilevel"/>
     <w:tmpl w:val="83EEEB6C"/>
@@ -11615,7 +11856,7 @@
       </w:rPr>
     </w:lvl>
   </w:abstractNum>
-  <w:abstractNum w:abstractNumId="47" w15:restartNumberingAfterBreak="0">
+  <w:abstractNum w:abstractNumId="48" w15:restartNumberingAfterBreak="0">
     <w:nsid w:val="3BD47AA0"/>
     <w:multiLevelType w:val="hybridMultilevel"/>
     <w:tmpl w:val="DF64C42C"/>
@@ -11759,7 +12000,7 @@
       </w:rPr>
     </w:lvl>
   </w:abstractNum>
-  <w:abstractNum w:abstractNumId="48" w15:restartNumberingAfterBreak="0">
+  <w:abstractNum w:abstractNumId="49" w15:restartNumberingAfterBreak="0">
     <w:nsid w:val="3CD97F90"/>
     <w:multiLevelType w:val="hybridMultilevel"/>
     <w:tmpl w:val="ADC84200"/>
@@ -11876,7 +12117,7 @@
       </w:pPr>
     </w:lvl>
   </w:abstractNum>
-  <w:abstractNum w:abstractNumId="49" w15:restartNumberingAfterBreak="0">
+  <w:abstractNum w:abstractNumId="50" w15:restartNumberingAfterBreak="0">
     <w:nsid w:val="3E5C125E"/>
     <w:multiLevelType w:val="hybridMultilevel"/>
     <w:tmpl w:val="468029D6"/>
@@ -12017,7 +12258,7 @@
       </w:rPr>
     </w:lvl>
   </w:abstractNum>
-  <w:abstractNum w:abstractNumId="50" w15:restartNumberingAfterBreak="0">
+  <w:abstractNum w:abstractNumId="51" w15:restartNumberingAfterBreak="0">
     <w:nsid w:val="3F5A2784"/>
     <w:multiLevelType w:val="hybridMultilevel"/>
     <w:tmpl w:val="87F0AD5C"/>
@@ -12113,7 +12354,7 @@
       </w:pPr>
     </w:lvl>
   </w:abstractNum>
-  <w:abstractNum w:abstractNumId="51" w15:restartNumberingAfterBreak="0">
+  <w:abstractNum w:abstractNumId="52" w15:restartNumberingAfterBreak="0">
     <w:nsid w:val="42BF5FF4"/>
     <w:multiLevelType w:val="hybridMultilevel"/>
     <w:tmpl w:val="998AB08A"/>
@@ -12255,7 +12496,7 @@
       </w:rPr>
     </w:lvl>
   </w:abstractNum>
-  <w:abstractNum w:abstractNumId="52" w15:restartNumberingAfterBreak="0">
+  <w:abstractNum w:abstractNumId="53" w15:restartNumberingAfterBreak="0">
     <w:nsid w:val="42DE0A6A"/>
     <w:multiLevelType w:val="hybridMultilevel"/>
     <w:tmpl w:val="39B08F68"/>
@@ -12395,7 +12636,7 @@
       </w:rPr>
     </w:lvl>
   </w:abstractNum>
-  <w:abstractNum w:abstractNumId="53" w15:restartNumberingAfterBreak="0">
+  <w:abstractNum w:abstractNumId="54" w15:restartNumberingAfterBreak="0">
     <w:nsid w:val="434C03BB"/>
     <w:multiLevelType w:val="multilevel"/>
     <w:tmpl w:val="0409001F"/>
@@ -12505,7 +12746,7 @@
       </w:pPr>
     </w:lvl>
   </w:abstractNum>
-  <w:abstractNum w:abstractNumId="54" w15:restartNumberingAfterBreak="0">
+  <w:abstractNum w:abstractNumId="55" w15:restartNumberingAfterBreak="0">
     <w:nsid w:val="44802B1E"/>
     <w:multiLevelType w:val="hybridMultilevel"/>
     <w:tmpl w:val="A45CEEBA"/>
@@ -12648,7 +12889,7 @@
       </w:rPr>
     </w:lvl>
   </w:abstractNum>
-  <w:abstractNum w:abstractNumId="55" w15:restartNumberingAfterBreak="0">
+  <w:abstractNum w:abstractNumId="56" w15:restartNumberingAfterBreak="0">
     <w:nsid w:val="45435070"/>
     <w:multiLevelType w:val="hybridMultilevel"/>
     <w:tmpl w:val="E0F6FACC"/>
@@ -12795,7 +13036,7 @@
       </w:rPr>
     </w:lvl>
   </w:abstractNum>
-  <w:abstractNum w:abstractNumId="56" w15:restartNumberingAfterBreak="0">
+  <w:abstractNum w:abstractNumId="57" w15:restartNumberingAfterBreak="0">
     <w:nsid w:val="47B417E4"/>
     <w:multiLevelType w:val="hybridMultilevel"/>
     <w:tmpl w:val="19ECB498"/>
@@ -12936,7 +13177,7 @@
       </w:rPr>
     </w:lvl>
   </w:abstractNum>
-  <w:abstractNum w:abstractNumId="57" w15:restartNumberingAfterBreak="0">
+  <w:abstractNum w:abstractNumId="58" w15:restartNumberingAfterBreak="0">
     <w:nsid w:val="48687CAB"/>
     <w:multiLevelType w:val="hybridMultilevel"/>
     <w:tmpl w:val="631494DA"/>
@@ -13057,7 +13298,7 @@
       </w:pPr>
     </w:lvl>
   </w:abstractNum>
-  <w:abstractNum w:abstractNumId="58" w15:restartNumberingAfterBreak="0">
+  <w:abstractNum w:abstractNumId="59" w15:restartNumberingAfterBreak="0">
     <w:nsid w:val="48DC6139"/>
     <w:multiLevelType w:val="hybridMultilevel"/>
     <w:tmpl w:val="942C053E"/>
@@ -13177,7 +13418,7 @@
       </w:pPr>
     </w:lvl>
   </w:abstractNum>
-  <w:abstractNum w:abstractNumId="59" w15:restartNumberingAfterBreak="0">
+  <w:abstractNum w:abstractNumId="60" w15:restartNumberingAfterBreak="0">
     <w:nsid w:val="4AF57006"/>
     <w:multiLevelType w:val="hybridMultilevel"/>
     <w:tmpl w:val="FA403326"/>
@@ -13318,7 +13559,7 @@
       </w:rPr>
     </w:lvl>
   </w:abstractNum>
-  <w:abstractNum w:abstractNumId="60" w15:restartNumberingAfterBreak="0">
+  <w:abstractNum w:abstractNumId="61" w15:restartNumberingAfterBreak="0">
     <w:nsid w:val="4C935B9D"/>
     <w:multiLevelType w:val="hybridMultilevel"/>
     <w:tmpl w:val="9E48C2BE"/>
@@ -13459,7 +13700,7 @@
       </w:rPr>
     </w:lvl>
   </w:abstractNum>
-  <w:abstractNum w:abstractNumId="61" w15:restartNumberingAfterBreak="0">
+  <w:abstractNum w:abstractNumId="62" w15:restartNumberingAfterBreak="0">
     <w:nsid w:val="4ECC27BE"/>
     <w:multiLevelType w:val="hybridMultilevel"/>
     <w:tmpl w:val="DD92A4CE"/>
@@ -13600,7 +13841,7 @@
       </w:rPr>
     </w:lvl>
   </w:abstractNum>
-  <w:abstractNum w:abstractNumId="62" w15:restartNumberingAfterBreak="0">
+  <w:abstractNum w:abstractNumId="63" w15:restartNumberingAfterBreak="0">
     <w:nsid w:val="4F5D58EC"/>
     <w:multiLevelType w:val="hybridMultilevel"/>
     <w:tmpl w:val="9D6EF168"/>
@@ -13713,7 +13954,7 @@
       </w:rPr>
     </w:lvl>
   </w:abstractNum>
-  <w:abstractNum w:abstractNumId="63" w15:restartNumberingAfterBreak="0">
+  <w:abstractNum w:abstractNumId="64" w15:restartNumberingAfterBreak="0">
     <w:nsid w:val="4F8B4CE6"/>
     <w:multiLevelType w:val="hybridMultilevel"/>
     <w:tmpl w:val="B6F4561C"/>
@@ -13809,7 +14050,7 @@
       </w:pPr>
     </w:lvl>
   </w:abstractNum>
-  <w:abstractNum w:abstractNumId="64" w15:restartNumberingAfterBreak="0">
+  <w:abstractNum w:abstractNumId="65" w15:restartNumberingAfterBreak="0">
     <w:nsid w:val="54225E88"/>
     <w:multiLevelType w:val="hybridMultilevel"/>
     <w:tmpl w:val="59CC3F94"/>
@@ -13929,7 +14170,7 @@
       </w:pPr>
     </w:lvl>
   </w:abstractNum>
-  <w:abstractNum w:abstractNumId="65" w15:restartNumberingAfterBreak="0">
+  <w:abstractNum w:abstractNumId="66" w15:restartNumberingAfterBreak="0">
     <w:nsid w:val="542F67C2"/>
     <w:multiLevelType w:val="singleLevel"/>
     <w:tmpl w:val="004E2FEA"/>
@@ -13951,7 +14192,7 @@
       </w:rPr>
     </w:lvl>
   </w:abstractNum>
-  <w:abstractNum w:abstractNumId="66" w15:restartNumberingAfterBreak="0">
+  <w:abstractNum w:abstractNumId="67" w15:restartNumberingAfterBreak="0">
     <w:nsid w:val="54BD290A"/>
     <w:multiLevelType w:val="hybridMultilevel"/>
     <w:tmpl w:val="418C2460"/>
@@ -14047,7 +14288,7 @@
       </w:pPr>
     </w:lvl>
   </w:abstractNum>
-  <w:abstractNum w:abstractNumId="67" w15:restartNumberingAfterBreak="0">
+  <w:abstractNum w:abstractNumId="68" w15:restartNumberingAfterBreak="0">
     <w:nsid w:val="55224605"/>
     <w:multiLevelType w:val="singleLevel"/>
     <w:tmpl w:val="E8D4C930"/>
@@ -14068,7 +14309,7 @@
       </w:rPr>
     </w:lvl>
   </w:abstractNum>
-  <w:abstractNum w:abstractNumId="68" w15:restartNumberingAfterBreak="0">
+  <w:abstractNum w:abstractNumId="69" w15:restartNumberingAfterBreak="0">
     <w:nsid w:val="55BD6C9B"/>
     <w:multiLevelType w:val="multilevel"/>
     <w:tmpl w:val="0F7A14AA"/>
@@ -14210,7 +14451,7 @@
       </w:rPr>
     </w:lvl>
   </w:abstractNum>
-  <w:abstractNum w:abstractNumId="69" w15:restartNumberingAfterBreak="0">
+  <w:abstractNum w:abstractNumId="70" w15:restartNumberingAfterBreak="0">
     <w:nsid w:val="56361D1F"/>
     <w:multiLevelType w:val="hybridMultilevel"/>
     <w:tmpl w:val="4DBC9BC6"/>
@@ -14299,7 +14540,7 @@
       </w:pPr>
     </w:lvl>
   </w:abstractNum>
-  <w:abstractNum w:abstractNumId="70" w15:restartNumberingAfterBreak="0">
+  <w:abstractNum w:abstractNumId="71" w15:restartNumberingAfterBreak="0">
     <w:nsid w:val="5A176565"/>
     <w:multiLevelType w:val="hybridMultilevel"/>
     <w:tmpl w:val="B79A3032"/>
@@ -14389,7 +14630,7 @@
       </w:pPr>
     </w:lvl>
   </w:abstractNum>
-  <w:abstractNum w:abstractNumId="71" w15:restartNumberingAfterBreak="0">
+  <w:abstractNum w:abstractNumId="72" w15:restartNumberingAfterBreak="0">
     <w:nsid w:val="5AA64B2B"/>
     <w:multiLevelType w:val="hybridMultilevel"/>
     <w:tmpl w:val="0AA4969A"/>
@@ -14502,7 +14743,7 @@
       </w:rPr>
     </w:lvl>
   </w:abstractNum>
-  <w:abstractNum w:abstractNumId="72" w15:restartNumberingAfterBreak="0">
+  <w:abstractNum w:abstractNumId="73" w15:restartNumberingAfterBreak="0">
     <w:nsid w:val="5CA57312"/>
     <w:multiLevelType w:val="hybridMultilevel"/>
     <w:tmpl w:val="631494DA"/>
@@ -14619,7 +14860,7 @@
       </w:pPr>
     </w:lvl>
   </w:abstractNum>
-  <w:abstractNum w:abstractNumId="73" w15:restartNumberingAfterBreak="0">
+  <w:abstractNum w:abstractNumId="74" w15:restartNumberingAfterBreak="0">
     <w:nsid w:val="5EC27D05"/>
     <w:multiLevelType w:val="hybridMultilevel"/>
     <w:tmpl w:val="B79A3032"/>
@@ -14709,7 +14950,7 @@
       </w:pPr>
     </w:lvl>
   </w:abstractNum>
-  <w:abstractNum w:abstractNumId="74" w15:restartNumberingAfterBreak="0">
+  <w:abstractNum w:abstractNumId="75" w15:restartNumberingAfterBreak="0">
     <w:nsid w:val="61584785"/>
     <w:multiLevelType w:val="hybridMultilevel"/>
     <w:tmpl w:val="74DEFC44"/>
@@ -14850,7 +15091,7 @@
       </w:rPr>
     </w:lvl>
   </w:abstractNum>
-  <w:abstractNum w:abstractNumId="75" w15:restartNumberingAfterBreak="0">
+  <w:abstractNum w:abstractNumId="76" w15:restartNumberingAfterBreak="0">
     <w:nsid w:val="62A64977"/>
     <w:multiLevelType w:val="singleLevel"/>
     <w:tmpl w:val="6756E066"/>
@@ -14871,7 +15112,7 @@
       </w:rPr>
     </w:lvl>
   </w:abstractNum>
-  <w:abstractNum w:abstractNumId="76" w15:restartNumberingAfterBreak="0">
+  <w:abstractNum w:abstractNumId="77" w15:restartNumberingAfterBreak="0">
     <w:nsid w:val="62AC3F30"/>
     <w:multiLevelType w:val="hybridMultilevel"/>
     <w:tmpl w:val="63E819BE"/>
@@ -14993,7 +15234,7 @@
       </w:pPr>
     </w:lvl>
   </w:abstractNum>
-  <w:abstractNum w:abstractNumId="77" w15:restartNumberingAfterBreak="0">
+  <w:abstractNum w:abstractNumId="78" w15:restartNumberingAfterBreak="0">
     <w:nsid w:val="654B49CE"/>
     <w:multiLevelType w:val="hybridMultilevel"/>
     <w:tmpl w:val="CDAE47AC"/>
@@ -15134,7 +15375,7 @@
       </w:rPr>
     </w:lvl>
   </w:abstractNum>
-  <w:abstractNum w:abstractNumId="78" w15:restartNumberingAfterBreak="0">
+  <w:abstractNum w:abstractNumId="79" w15:restartNumberingAfterBreak="0">
     <w:nsid w:val="68694999"/>
     <w:multiLevelType w:val="hybridMultilevel"/>
     <w:tmpl w:val="BCFCC1A4"/>
@@ -15277,7 +15518,7 @@
       </w:rPr>
     </w:lvl>
   </w:abstractNum>
-  <w:abstractNum w:abstractNumId="79" w15:restartNumberingAfterBreak="0">
+  <w:abstractNum w:abstractNumId="80" w15:restartNumberingAfterBreak="0">
     <w:nsid w:val="68BB2E00"/>
     <w:multiLevelType w:val="hybridMultilevel"/>
     <w:tmpl w:val="B91E3BEE"/>
@@ -15373,7 +15614,7 @@
       </w:pPr>
     </w:lvl>
   </w:abstractNum>
-  <w:abstractNum w:abstractNumId="80" w15:restartNumberingAfterBreak="0">
+  <w:abstractNum w:abstractNumId="81" w15:restartNumberingAfterBreak="0">
     <w:nsid w:val="6A691815"/>
     <w:multiLevelType w:val="multilevel"/>
     <w:tmpl w:val="93CC7380"/>
@@ -15494,7 +15735,7 @@
       </w:pPr>
     </w:lvl>
   </w:abstractNum>
-  <w:abstractNum w:abstractNumId="81" w15:restartNumberingAfterBreak="0">
+  <w:abstractNum w:abstractNumId="82" w15:restartNumberingAfterBreak="0">
     <w:nsid w:val="6A867275"/>
     <w:multiLevelType w:val="hybridMultilevel"/>
     <w:tmpl w:val="80F847CE"/>
@@ -15636,7 +15877,7 @@
       </w:rPr>
     </w:lvl>
   </w:abstractNum>
-  <w:abstractNum w:abstractNumId="82" w15:restartNumberingAfterBreak="0">
+  <w:abstractNum w:abstractNumId="83" w15:restartNumberingAfterBreak="0">
     <w:nsid w:val="6B735A56"/>
     <w:multiLevelType w:val="multilevel"/>
     <w:tmpl w:val="F236952A"/>
@@ -15814,7 +16055,7 @@
       </w:rPr>
     </w:lvl>
   </w:abstractNum>
-  <w:abstractNum w:abstractNumId="83" w15:restartNumberingAfterBreak="0">
+  <w:abstractNum w:abstractNumId="84" w15:restartNumberingAfterBreak="0">
     <w:nsid w:val="6E296E5A"/>
     <w:multiLevelType w:val="hybridMultilevel"/>
     <w:tmpl w:val="B79A3032"/>
@@ -15903,7 +16144,7 @@
       </w:pPr>
     </w:lvl>
   </w:abstractNum>
-  <w:abstractNum w:abstractNumId="84" w15:restartNumberingAfterBreak="0">
+  <w:abstractNum w:abstractNumId="85" w15:restartNumberingAfterBreak="0">
     <w:nsid w:val="6F113A2A"/>
     <w:multiLevelType w:val="multilevel"/>
     <w:tmpl w:val="7AD6FA78"/>
@@ -16042,7 +16283,7 @@
       </w:rPr>
     </w:lvl>
   </w:abstractNum>
-  <w:abstractNum w:abstractNumId="85" w15:restartNumberingAfterBreak="0">
+  <w:abstractNum w:abstractNumId="86" w15:restartNumberingAfterBreak="0">
     <w:nsid w:val="6F421549"/>
     <w:multiLevelType w:val="hybridMultilevel"/>
     <w:tmpl w:val="6D7A61B4"/>
@@ -16183,7 +16424,7 @@
       </w:rPr>
     </w:lvl>
   </w:abstractNum>
-  <w:abstractNum w:abstractNumId="86" w15:restartNumberingAfterBreak="0">
+  <w:abstractNum w:abstractNumId="87" w15:restartNumberingAfterBreak="0">
     <w:nsid w:val="71CA3340"/>
     <w:multiLevelType w:val="singleLevel"/>
     <w:tmpl w:val="CB0C3DD0"/>
@@ -16204,7 +16445,7 @@
       </w:rPr>
     </w:lvl>
   </w:abstractNum>
-  <w:abstractNum w:abstractNumId="87" w15:restartNumberingAfterBreak="0">
+  <w:abstractNum w:abstractNumId="88" w15:restartNumberingAfterBreak="0">
     <w:nsid w:val="739B453D"/>
     <w:multiLevelType w:val="hybridMultilevel"/>
     <w:tmpl w:val="F8824CF6"/>
@@ -16346,7 +16587,7 @@
       </w:rPr>
     </w:lvl>
   </w:abstractNum>
-  <w:abstractNum w:abstractNumId="88" w15:restartNumberingAfterBreak="0">
+  <w:abstractNum w:abstractNumId="89" w15:restartNumberingAfterBreak="0">
     <w:nsid w:val="747A49BB"/>
     <w:multiLevelType w:val="hybridMultilevel"/>
     <w:tmpl w:val="82F20366"/>
@@ -16472,7 +16713,7 @@
       </w:pPr>
     </w:lvl>
   </w:abstractNum>
-  <w:abstractNum w:abstractNumId="89" w15:restartNumberingAfterBreak="0">
+  <w:abstractNum w:abstractNumId="90" w15:restartNumberingAfterBreak="0">
     <w:nsid w:val="74CD3F03"/>
     <w:multiLevelType w:val="multilevel"/>
     <w:tmpl w:val="6EEE39AA"/>
@@ -16587,7 +16828,7 @@
       </w:pPr>
     </w:lvl>
   </w:abstractNum>
-  <w:abstractNum w:abstractNumId="90" w15:restartNumberingAfterBreak="0">
+  <w:abstractNum w:abstractNumId="91" w15:restartNumberingAfterBreak="0">
     <w:nsid w:val="76BC6478"/>
     <w:multiLevelType w:val="hybridMultilevel"/>
     <w:tmpl w:val="143EEFEE"/>
@@ -16677,7 +16918,7 @@
       </w:pPr>
     </w:lvl>
   </w:abstractNum>
-  <w:abstractNum w:abstractNumId="91" w15:restartNumberingAfterBreak="0">
+  <w:abstractNum w:abstractNumId="92" w15:restartNumberingAfterBreak="0">
     <w:nsid w:val="77316C26"/>
     <w:multiLevelType w:val="hybridMultilevel"/>
     <w:tmpl w:val="761EC4E4"/>
@@ -16818,7 +17059,7 @@
       </w:rPr>
     </w:lvl>
   </w:abstractNum>
-  <w:abstractNum w:abstractNumId="92" w15:restartNumberingAfterBreak="0">
+  <w:abstractNum w:abstractNumId="93" w15:restartNumberingAfterBreak="0">
     <w:nsid w:val="782F7664"/>
     <w:multiLevelType w:val="hybridMultilevel"/>
     <w:tmpl w:val="5B148ADA"/>
@@ -16908,7 +17149,7 @@
       </w:pPr>
     </w:lvl>
   </w:abstractNum>
-  <w:abstractNum w:abstractNumId="93" w15:restartNumberingAfterBreak="0">
+  <w:abstractNum w:abstractNumId="94" w15:restartNumberingAfterBreak="0">
     <w:nsid w:val="78CB665E"/>
     <w:multiLevelType w:val="singleLevel"/>
     <w:tmpl w:val="7ED2B38E"/>
@@ -16931,7 +17172,7 @@
       </w:rPr>
     </w:lvl>
   </w:abstractNum>
-  <w:abstractNum w:abstractNumId="94" w15:restartNumberingAfterBreak="0">
+  <w:abstractNum w:abstractNumId="95" w15:restartNumberingAfterBreak="0">
     <w:nsid w:val="795B78AE"/>
     <w:multiLevelType w:val="hybridMultilevel"/>
     <w:tmpl w:val="9A40197C"/>
@@ -17072,7 +17313,7 @@
       </w:rPr>
     </w:lvl>
   </w:abstractNum>
-  <w:abstractNum w:abstractNumId="95" w15:restartNumberingAfterBreak="0">
+  <w:abstractNum w:abstractNumId="96" w15:restartNumberingAfterBreak="0">
     <w:nsid w:val="79D41200"/>
     <w:multiLevelType w:val="hybridMultilevel"/>
     <w:tmpl w:val="A46EA226"/>
@@ -17185,7 +17426,7 @@
       </w:rPr>
     </w:lvl>
   </w:abstractNum>
-  <w:abstractNum w:abstractNumId="96" w15:restartNumberingAfterBreak="0">
+  <w:abstractNum w:abstractNumId="97" w15:restartNumberingAfterBreak="0">
     <w:nsid w:val="7BA81FA1"/>
     <w:multiLevelType w:val="hybridMultilevel"/>
     <w:tmpl w:val="7E864132"/>
@@ -17274,7 +17515,7 @@
       </w:pPr>
     </w:lvl>
   </w:abstractNum>
-  <w:abstractNum w:abstractNumId="97" w15:restartNumberingAfterBreak="0">
+  <w:abstractNum w:abstractNumId="98" w15:restartNumberingAfterBreak="0">
     <w:nsid w:val="7C2868B3"/>
     <w:multiLevelType w:val="hybridMultilevel"/>
     <w:tmpl w:val="BD88A1B6"/>
@@ -17414,7 +17655,7 @@
       </w:rPr>
     </w:lvl>
   </w:abstractNum>
-  <w:abstractNum w:abstractNumId="98" w15:restartNumberingAfterBreak="0">
+  <w:abstractNum w:abstractNumId="99" w15:restartNumberingAfterBreak="0">
     <w:nsid w:val="7DF32011"/>
     <w:multiLevelType w:val="singleLevel"/>
     <w:tmpl w:val="BEE61368"/>
@@ -17437,13 +17678,13 @@
     </w:lvl>
   </w:abstractNum>
   <w:num w:numId="1" w16cid:durableId="1134832989">
-    <w:abstractNumId w:val="21"/>
+    <w:abstractNumId w:val="22"/>
   </w:num>
   <w:num w:numId="2" w16cid:durableId="877477097">
-    <w:abstractNumId w:val="97"/>
+    <w:abstractNumId w:val="98"/>
   </w:num>
   <w:num w:numId="3" w16cid:durableId="1978415342">
-    <w:abstractNumId w:val="67"/>
+    <w:abstractNumId w:val="68"/>
   </w:num>
   <w:num w:numId="4" w16cid:durableId="1032415028">
     <w:abstractNumId w:val="12"/>
@@ -17452,22 +17693,22 @@
     <w:abstractNumId w:val="12"/>
   </w:num>
   <w:num w:numId="6" w16cid:durableId="1319962317">
-    <w:abstractNumId w:val="78"/>
+    <w:abstractNumId w:val="79"/>
   </w:num>
   <w:num w:numId="7" w16cid:durableId="727649944">
-    <w:abstractNumId w:val="80"/>
+    <w:abstractNumId w:val="81"/>
   </w:num>
   <w:num w:numId="8" w16cid:durableId="808546847">
-    <w:abstractNumId w:val="33"/>
+    <w:abstractNumId w:val="34"/>
   </w:num>
   <w:num w:numId="9" w16cid:durableId="240678175">
-    <w:abstractNumId w:val="57"/>
+    <w:abstractNumId w:val="58"/>
   </w:num>
   <w:num w:numId="10" w16cid:durableId="2008365047">
-    <w:abstractNumId w:val="52"/>
+    <w:abstractNumId w:val="53"/>
   </w:num>
   <w:num w:numId="11" w16cid:durableId="1921407865">
-    <w:abstractNumId w:val="61"/>
+    <w:abstractNumId w:val="62"/>
   </w:num>
   <w:num w:numId="12" w16cid:durableId="415328487">
     <w:abstractNumId w:val="1"/>
@@ -17476,46 +17717,46 @@
     <w:abstractNumId w:val="0"/>
   </w:num>
   <w:num w:numId="14" w16cid:durableId="1944459559">
-    <w:abstractNumId w:val="74"/>
+    <w:abstractNumId w:val="75"/>
   </w:num>
   <w:num w:numId="15" w16cid:durableId="429740038">
-    <w:abstractNumId w:val="86"/>
+    <w:abstractNumId w:val="87"/>
   </w:num>
   <w:num w:numId="16" w16cid:durableId="1738239227">
-    <w:abstractNumId w:val="84"/>
+    <w:abstractNumId w:val="85"/>
   </w:num>
   <w:num w:numId="17" w16cid:durableId="1769232566">
-    <w:abstractNumId w:val="85"/>
+    <w:abstractNumId w:val="86"/>
   </w:num>
   <w:num w:numId="18" w16cid:durableId="1908808563">
     <w:abstractNumId w:val="8"/>
   </w:num>
   <w:num w:numId="19" w16cid:durableId="1093743779">
-    <w:abstractNumId w:val="64"/>
+    <w:abstractNumId w:val="65"/>
   </w:num>
   <w:num w:numId="20" w16cid:durableId="331376593">
     <w:abstractNumId w:val="16"/>
   </w:num>
   <w:num w:numId="21" w16cid:durableId="925503198">
-    <w:abstractNumId w:val="34"/>
+    <w:abstractNumId w:val="35"/>
     <w:lvlOverride w:ilvl="0">
       <w:startOverride w:val="1"/>
     </w:lvlOverride>
   </w:num>
   <w:num w:numId="22" w16cid:durableId="2055150832">
-    <w:abstractNumId w:val="38"/>
+    <w:abstractNumId w:val="39"/>
   </w:num>
   <w:num w:numId="23" w16cid:durableId="989016324">
-    <w:abstractNumId w:val="24"/>
+    <w:abstractNumId w:val="25"/>
   </w:num>
   <w:num w:numId="24" w16cid:durableId="1579096485">
     <w:abstractNumId w:val="17"/>
   </w:num>
   <w:num w:numId="25" w16cid:durableId="2046565101">
-    <w:abstractNumId w:val="31"/>
+    <w:abstractNumId w:val="32"/>
   </w:num>
   <w:num w:numId="26" w16cid:durableId="1176765793">
-    <w:abstractNumId w:val="26"/>
+    <w:abstractNumId w:val="27"/>
     <w:lvlOverride w:ilvl="0">
       <w:startOverride w:val="1"/>
     </w:lvlOverride>
@@ -17527,82 +17768,82 @@
     <w:abstractNumId w:val="7"/>
   </w:num>
   <w:num w:numId="29" w16cid:durableId="1020592900">
-    <w:abstractNumId w:val="29"/>
+    <w:abstractNumId w:val="30"/>
   </w:num>
   <w:num w:numId="30" w16cid:durableId="978418303">
     <w:abstractNumId w:val="18"/>
   </w:num>
   <w:num w:numId="31" w16cid:durableId="633294552">
-    <w:abstractNumId w:val="39"/>
+    <w:abstractNumId w:val="40"/>
   </w:num>
   <w:num w:numId="32" w16cid:durableId="775716638">
     <w:abstractNumId w:val="13"/>
   </w:num>
   <w:num w:numId="33" w16cid:durableId="404881546">
-    <w:abstractNumId w:val="48"/>
+    <w:abstractNumId w:val="49"/>
   </w:num>
   <w:num w:numId="34" w16cid:durableId="421880012">
-    <w:abstractNumId w:val="19"/>
+    <w:abstractNumId w:val="20"/>
   </w:num>
   <w:num w:numId="35" w16cid:durableId="1106073664">
-    <w:abstractNumId w:val="42"/>
+    <w:abstractNumId w:val="43"/>
   </w:num>
   <w:num w:numId="36" w16cid:durableId="1757049459">
-    <w:abstractNumId w:val="56"/>
+    <w:abstractNumId w:val="57"/>
   </w:num>
   <w:num w:numId="37" w16cid:durableId="537857484">
-    <w:abstractNumId w:val="68"/>
+    <w:abstractNumId w:val="69"/>
   </w:num>
   <w:num w:numId="38" w16cid:durableId="415980425">
-    <w:abstractNumId w:val="58"/>
+    <w:abstractNumId w:val="59"/>
   </w:num>
   <w:num w:numId="39" w16cid:durableId="814377956">
-    <w:abstractNumId w:val="60"/>
+    <w:abstractNumId w:val="61"/>
   </w:num>
   <w:num w:numId="40" w16cid:durableId="637151242">
-    <w:abstractNumId w:val="45"/>
+    <w:abstractNumId w:val="46"/>
   </w:num>
   <w:num w:numId="41" w16cid:durableId="794326802">
-    <w:abstractNumId w:val="27"/>
+    <w:abstractNumId w:val="28"/>
   </w:num>
   <w:num w:numId="42" w16cid:durableId="983631059">
-    <w:abstractNumId w:val="77"/>
+    <w:abstractNumId w:val="78"/>
   </w:num>
   <w:num w:numId="43" w16cid:durableId="677537348">
-    <w:abstractNumId w:val="88"/>
+    <w:abstractNumId w:val="89"/>
   </w:num>
   <w:num w:numId="44" w16cid:durableId="554317282">
-    <w:abstractNumId w:val="59"/>
+    <w:abstractNumId w:val="60"/>
   </w:num>
   <w:num w:numId="45" w16cid:durableId="1826508651">
     <w:abstractNumId w:val="11"/>
   </w:num>
   <w:num w:numId="46" w16cid:durableId="1700204622">
-    <w:abstractNumId w:val="47"/>
+    <w:abstractNumId w:val="48"/>
   </w:num>
   <w:num w:numId="47" w16cid:durableId="1709139240">
     <w:abstractNumId w:val="14"/>
   </w:num>
   <w:num w:numId="48" w16cid:durableId="689796704">
-    <w:abstractNumId w:val="25"/>
+    <w:abstractNumId w:val="26"/>
   </w:num>
   <w:num w:numId="49" w16cid:durableId="27224180">
-    <w:abstractNumId w:val="23"/>
+    <w:abstractNumId w:val="24"/>
   </w:num>
   <w:num w:numId="50" w16cid:durableId="1728190281">
-    <w:abstractNumId w:val="98"/>
+    <w:abstractNumId w:val="99"/>
   </w:num>
   <w:num w:numId="51" w16cid:durableId="241255097">
-    <w:abstractNumId w:val="65"/>
+    <w:abstractNumId w:val="66"/>
   </w:num>
   <w:num w:numId="52" w16cid:durableId="1420906572">
-    <w:abstractNumId w:val="93"/>
+    <w:abstractNumId w:val="94"/>
   </w:num>
   <w:num w:numId="53" w16cid:durableId="523327005">
-    <w:abstractNumId w:val="51"/>
+    <w:abstractNumId w:val="52"/>
   </w:num>
   <w:num w:numId="54" w16cid:durableId="1051078834">
-    <w:abstractNumId w:val="30"/>
+    <w:abstractNumId w:val="31"/>
   </w:num>
   <w:num w:numId="55" w16cid:durableId="53050049">
     <w:abstractNumId w:val="9"/>
@@ -17611,7 +17852,7 @@
     <w:abstractNumId w:val="3"/>
   </w:num>
   <w:num w:numId="57" w16cid:durableId="762918227">
-    <w:abstractNumId w:val="89"/>
+    <w:abstractNumId w:val="90"/>
     <w:lvlOverride w:ilvl="0">
       <w:startOverride w:val="1"/>
     </w:lvlOverride>
@@ -17641,7 +17882,7 @@
     </w:lvlOverride>
   </w:num>
   <w:num w:numId="58" w16cid:durableId="1486507407">
-    <w:abstractNumId w:val="57"/>
+    <w:abstractNumId w:val="58"/>
     <w:lvlOverride w:ilvl="0">
       <w:startOverride w:val="1"/>
     </w:lvlOverride>
@@ -17671,28 +17912,28 @@
     </w:lvlOverride>
   </w:num>
   <w:num w:numId="59" w16cid:durableId="604119794">
-    <w:abstractNumId w:val="66"/>
+    <w:abstractNumId w:val="67"/>
   </w:num>
   <w:num w:numId="60" w16cid:durableId="1769740083">
-    <w:abstractNumId w:val="63"/>
+    <w:abstractNumId w:val="64"/>
   </w:num>
   <w:num w:numId="61" w16cid:durableId="1782218626">
+    <w:abstractNumId w:val="74"/>
+  </w:num>
+  <w:num w:numId="62" w16cid:durableId="1626883728">
     <w:abstractNumId w:val="73"/>
   </w:num>
-  <w:num w:numId="62" w16cid:durableId="1626883728">
-    <w:abstractNumId w:val="72"/>
-  </w:num>
   <w:num w:numId="63" w16cid:durableId="370762213">
-    <w:abstractNumId w:val="90"/>
+    <w:abstractNumId w:val="91"/>
   </w:num>
   <w:num w:numId="64" w16cid:durableId="386536658">
-    <w:abstractNumId w:val="92"/>
+    <w:abstractNumId w:val="93"/>
   </w:num>
   <w:num w:numId="65" w16cid:durableId="2145072957">
-    <w:abstractNumId w:val="94"/>
+    <w:abstractNumId w:val="95"/>
   </w:num>
   <w:num w:numId="66" w16cid:durableId="1689603706">
-    <w:abstractNumId w:val="76"/>
+    <w:abstractNumId w:val="77"/>
   </w:num>
   <w:num w:numId="67" w16cid:durableId="1896428602">
     <w:abstractNumId w:val="2"/>
@@ -17717,10 +17958,10 @@
     </w:lvlOverride>
   </w:num>
   <w:num w:numId="68" w16cid:durableId="861743269">
-    <w:abstractNumId w:val="53"/>
+    <w:abstractNumId w:val="54"/>
   </w:num>
   <w:num w:numId="69" w16cid:durableId="2118258669">
-    <w:abstractNumId w:val="40"/>
+    <w:abstractNumId w:val="41"/>
     <w:lvlOverride w:ilvl="0">
       <w:lvl w:ilvl="0">
         <w:start w:val="1"/>
@@ -17845,73 +18086,73 @@
     </w:lvlOverride>
   </w:num>
   <w:num w:numId="70" w16cid:durableId="1877110704">
-    <w:abstractNumId w:val="54"/>
+    <w:abstractNumId w:val="55"/>
   </w:num>
   <w:num w:numId="71" w16cid:durableId="1313293433">
-    <w:abstractNumId w:val="49"/>
+    <w:abstractNumId w:val="50"/>
   </w:num>
   <w:num w:numId="72" w16cid:durableId="1921402083">
-    <w:abstractNumId w:val="55"/>
+    <w:abstractNumId w:val="56"/>
   </w:num>
   <w:num w:numId="73" w16cid:durableId="29960724">
-    <w:abstractNumId w:val="81"/>
+    <w:abstractNumId w:val="82"/>
   </w:num>
   <w:num w:numId="74" w16cid:durableId="781798612">
-    <w:abstractNumId w:val="87"/>
+    <w:abstractNumId w:val="88"/>
   </w:num>
   <w:num w:numId="75" w16cid:durableId="232400066">
+    <w:abstractNumId w:val="71"/>
+  </w:num>
+  <w:num w:numId="76" w16cid:durableId="1366835028">
+    <w:abstractNumId w:val="83"/>
+  </w:num>
+  <w:num w:numId="77" w16cid:durableId="2145854636">
+    <w:abstractNumId w:val="76"/>
+  </w:num>
+  <w:num w:numId="78" w16cid:durableId="638070556">
+    <w:abstractNumId w:val="47"/>
+  </w:num>
+  <w:num w:numId="79" w16cid:durableId="57097618">
+    <w:abstractNumId w:val="92"/>
+  </w:num>
+  <w:num w:numId="80" w16cid:durableId="964772959">
+    <w:abstractNumId w:val="80"/>
+  </w:num>
+  <w:num w:numId="81" w16cid:durableId="144396051">
+    <w:abstractNumId w:val="29"/>
+  </w:num>
+  <w:num w:numId="82" w16cid:durableId="1451437691">
+    <w:abstractNumId w:val="51"/>
+  </w:num>
+  <w:num w:numId="83" w16cid:durableId="834685886">
     <w:abstractNumId w:val="70"/>
   </w:num>
-  <w:num w:numId="76" w16cid:durableId="1366835028">
-    <w:abstractNumId w:val="82"/>
-  </w:num>
-  <w:num w:numId="77" w16cid:durableId="2145854636">
-    <w:abstractNumId w:val="75"/>
-  </w:num>
-  <w:num w:numId="78" w16cid:durableId="638070556">
-    <w:abstractNumId w:val="46"/>
-  </w:num>
-  <w:num w:numId="79" w16cid:durableId="57097618">
-    <w:abstractNumId w:val="91"/>
-  </w:num>
-  <w:num w:numId="80" w16cid:durableId="964772959">
-    <w:abstractNumId w:val="79"/>
-  </w:num>
-  <w:num w:numId="81" w16cid:durableId="144396051">
-    <w:abstractNumId w:val="28"/>
-  </w:num>
-  <w:num w:numId="82" w16cid:durableId="1451437691">
-    <w:abstractNumId w:val="50"/>
-  </w:num>
-  <w:num w:numId="83" w16cid:durableId="834685886">
-    <w:abstractNumId w:val="69"/>
-  </w:num>
   <w:num w:numId="84" w16cid:durableId="440539363">
-    <w:abstractNumId w:val="44"/>
+    <w:abstractNumId w:val="45"/>
   </w:num>
   <w:num w:numId="85" w16cid:durableId="728695394">
-    <w:abstractNumId w:val="36"/>
+    <w:abstractNumId w:val="37"/>
   </w:num>
   <w:num w:numId="86" w16cid:durableId="817963582">
-    <w:abstractNumId w:val="22"/>
+    <w:abstractNumId w:val="23"/>
   </w:num>
   <w:num w:numId="87" w16cid:durableId="304967595">
-    <w:abstractNumId w:val="83"/>
+    <w:abstractNumId w:val="84"/>
   </w:num>
   <w:num w:numId="88" w16cid:durableId="30109217">
-    <w:abstractNumId w:val="95"/>
+    <w:abstractNumId w:val="96"/>
   </w:num>
   <w:num w:numId="89" w16cid:durableId="2037388046">
-    <w:abstractNumId w:val="41"/>
+    <w:abstractNumId w:val="42"/>
   </w:num>
   <w:num w:numId="90" w16cid:durableId="227573031">
-    <w:abstractNumId w:val="20"/>
+    <w:abstractNumId w:val="21"/>
   </w:num>
   <w:num w:numId="91" w16cid:durableId="670135708">
     <w:abstractNumId w:val="15"/>
   </w:num>
   <w:num w:numId="92" w16cid:durableId="553547208">
-    <w:abstractNumId w:val="62"/>
+    <w:abstractNumId w:val="63"/>
   </w:num>
   <w:num w:numId="93" w16cid:durableId="257951415">
     <w:abstractNumId w:val="6"/>
@@ -17944,31 +18185,34 @@
     </w:lvlOverride>
   </w:num>
   <w:num w:numId="94" w16cid:durableId="911083381">
-    <w:abstractNumId w:val="35"/>
+    <w:abstractNumId w:val="36"/>
   </w:num>
   <w:num w:numId="95" w16cid:durableId="40325240">
-    <w:abstractNumId w:val="96"/>
+    <w:abstractNumId w:val="97"/>
   </w:num>
   <w:num w:numId="96" w16cid:durableId="260144515">
     <w:abstractNumId w:val="10"/>
   </w:num>
   <w:num w:numId="97" w16cid:durableId="1762215297">
-    <w:abstractNumId w:val="71"/>
+    <w:abstractNumId w:val="72"/>
   </w:num>
   <w:num w:numId="98" w16cid:durableId="1375158804">
     <w:abstractNumId w:val="5"/>
   </w:num>
   <w:num w:numId="99" w16cid:durableId="1891266884">
-    <w:abstractNumId w:val="32"/>
+    <w:abstractNumId w:val="33"/>
   </w:num>
   <w:num w:numId="100" w16cid:durableId="126171746">
-    <w:abstractNumId w:val="43"/>
+    <w:abstractNumId w:val="44"/>
   </w:num>
   <w:num w:numId="101" w16cid:durableId="2144694031">
     <w:abstractNumId w:val="2"/>
   </w:num>
   <w:num w:numId="102" w16cid:durableId="148445908">
-    <w:abstractNumId w:val="37"/>
+    <w:abstractNumId w:val="38"/>
+  </w:num>
+  <w:num w:numId="103" w16cid:durableId="4208862">
+    <w:abstractNumId w:val="19"/>
   </w:num>
   <w:numIdMacAtCleanup w:val="97"/>
 </w:numbering>

</xml_diff>